<commit_message>
rule based and static comparison report
</commit_message>
<xml_diff>
--- a/docs/Full Report Draft 1.docx
+++ b/docs/Full Report Draft 1.docx
@@ -3949,106 +3949,41 @@
     <w:p>
       <w:pPr>
         <w:pStyle w:val="Heading1"/>
-        <w:rPr>
-          <w:lang w:eastAsia="en-GB"/>
-        </w:rPr>
-      </w:pPr>
-      <w:r>
-        <w:rPr>
-          <w:lang w:eastAsia="en-GB"/>
-        </w:rPr>
-        <w:t>Results</w:t>
-      </w:r>
-    </w:p>
-    <w:p>
-      <w:pPr>
-        <w:jc w:val="both"/>
-        <w:rPr>
-          <w:lang w:eastAsia="en-GB"/>
-        </w:rPr>
-      </w:pPr>
-      <w:r>
-        <w:rPr>
-          <w:lang w:eastAsia="en-GB"/>
-        </w:rPr>
-        <w:t>This section will present the experimental results after the implementation and evaluation stages are complete.</w:t>
+      </w:pPr>
+      <w:r>
+        <w:t>Results and Evaluation</w:t>
+      </w:r>
+    </w:p>
+    <w:p>
+      <w:pPr>
+        <w:jc w:val="both"/>
+      </w:pPr>
+      <w:r>
+        <w:t>This section presents the experimental results collected from the Godot prototype. The results were analysed using exploratory data analysis in a Jupyter notebook. The notebook combined the CSV files generated by the experiment manager and produced summary tables and plots for comparing the static baseline with the rule-based DDA system.</w:t>
+      </w:r>
+    </w:p>
+    <w:p>
+      <w:pPr>
+        <w:jc w:val="both"/>
+      </w:pPr>
+      <w:r>
+        <w:t>The current results compare two difficulty systems: static difficulty and rule-based Dynamic Difficulty Adjustment. The RL-based DDA system will be added in the next stage of the project. The purpose of this section is to establish whether a simple adaptive system can improve on a fixed difficulty setting before evaluating the reinforcement-learning approach.</w:t>
       </w:r>
     </w:p>
     <w:p>
       <w:pPr>
         <w:pStyle w:val="Heading2"/>
-        <w:rPr>
-          <w:lang w:eastAsia="en-GB"/>
-        </w:rPr>
-      </w:pPr>
-      <w:r>
-        <w:rPr>
-          <w:lang w:eastAsia="en-GB"/>
-        </w:rPr>
+      </w:pPr>
+      <w:r>
         <w:t>4.1 Static Baseline Results</w:t>
       </w:r>
     </w:p>
     <w:p>
       <w:pPr>
         <w:jc w:val="both"/>
-        <w:rPr>
-          <w:lang w:eastAsia="en-GB"/>
-        </w:rPr>
-      </w:pPr>
-      <w:r>
-        <w:rPr>
-          <w:lang w:eastAsia="en-GB"/>
-        </w:rPr>
-        <w:t>The first stage of testing focused on static difficulty level 5. This difficulty level was calibrated to represent a medium challenge for the intermediate simulated player profile. Earlier testing showed that the original difficulty mapping was too hard, as the intermediate profile died in every run. The enemy difficulty mapping was therefore adjusted so that difficulty level 5 produced a more balanced outcome for the intermediate profile.</w:t>
-      </w:r>
-    </w:p>
-    <w:p>
-      <w:pPr>
-        <w:jc w:val="both"/>
-        <w:rPr>
-          <w:lang w:eastAsia="en-GB"/>
-        </w:rPr>
-      </w:pPr>
-      <w:r>
-        <w:rPr>
-          <w:lang w:eastAsia="en-GB"/>
-        </w:rPr>
-        <w:t>After calibration, each simulated player profile was tested for 30 runs at static difficulty level 5. The profiles tested were beginner, intermediate, skilled, inconsistent, and improving. The purpose of this test was to examine whether one fixed difficulty level could produce balanced gameplay across different simulated player behaviours.</w:t>
-      </w:r>
-    </w:p>
-    <w:p>
-      <w:pPr>
-        <w:jc w:val="both"/>
-        <w:rPr>
-          <w:lang w:eastAsia="en-GB"/>
-        </w:rPr>
-      </w:pPr>
-      <w:r>
-        <w:rPr>
-          <w:lang w:eastAsia="en-GB"/>
-        </w:rPr>
-        <w:lastRenderedPageBreak/>
-        <w:t>[Insert Table 1: Static baseline summary table]</w:t>
-      </w:r>
-      <w:r>
-        <w:rPr>
-          <w:lang w:eastAsia="en-GB"/>
-        </w:rPr>
-        <w:t>.</w:t>
-      </w:r>
-    </w:p>
-    <w:p>
-      <w:pPr>
-        <w:jc w:val="both"/>
-        <w:rPr>
-          <w:lang w:eastAsia="en-GB"/>
-        </w:rPr>
-      </w:pPr>
-      <w:r>
-        <w:rPr>
-          <w:lang w:eastAsia="en-GB"/>
-        </w:rPr>
-        <w:t>The results show that static difficulty level 5 affected each profile differently. The beginner profile died in 28 out of 30 runs, showing that the fixed difficulty was too difficult for weaker simulated behaviour. The intermediate profile died in 14 out of 30 runs, which was close to the intended medium baseline. The skilled profile died in only 4 out of 30 runs, showing that the same difficulty level was too easy for stronger simulated behaviour.</w:t>
+      </w:pPr>
+      <w:r>
+        <w:t>The static baseline was tested using difficulty level 5. This difficulty level was intended to represent a medium challenge for the intermediate simulated player profile. Each simulated player profile was tested for 30 runs under the same fixed difficulty setting.</w:t>
       </w:r>
     </w:p>
     <w:p>
@@ -4057,33 +3992,22 @@
         <w:jc w:val="both"/>
       </w:pPr>
       <w:r>
-        <w:rPr>
-          <w:noProof/>
-          <w:lang w:eastAsia="en-GB"/>
-        </w:rPr>
         <w:drawing>
-          <wp:inline distT="0" distB="0" distL="0" distR="0" wp14:anchorId="4C7CABD9" wp14:editId="247A8652">
-            <wp:extent cx="5731510" cy="3582035"/>
-            <wp:effectExtent l="0" t="0" r="0" b="0"/>
-            <wp:docPr id="996829929" name="Picture 1"/>
+          <wp:inline xmlns:a="http://schemas.openxmlformats.org/drawingml/2006/main" xmlns:pic="http://schemas.openxmlformats.org/drawingml/2006/picture">
+            <wp:extent cx="5731510" cy="3582194"/>
+            <wp:docPr id="1" name="Picture 1"/>
             <wp:cNvGraphicFramePr>
-              <a:graphicFrameLocks xmlns:a="http://schemas.openxmlformats.org/drawingml/2006/main" noChangeAspect="1"/>
+              <a:graphicFrameLocks noChangeAspect="1"/>
             </wp:cNvGraphicFramePr>
-            <a:graphic xmlns:a="http://schemas.openxmlformats.org/drawingml/2006/main">
+            <a:graphic>
               <a:graphicData uri="http://schemas.openxmlformats.org/drawingml/2006/picture">
-                <pic:pic xmlns:pic="http://schemas.openxmlformats.org/drawingml/2006/picture">
+                <pic:pic>
                   <pic:nvPicPr>
-                    <pic:cNvPr id="996829929" name="Picture 996829929"/>
+                    <pic:cNvPr id="0" name="static_baseline_outcomes_by_profile.png"/>
                     <pic:cNvPicPr/>
                   </pic:nvPicPr>
                   <pic:blipFill>
-                    <a:blip r:embed="rId6" cstate="print">
-                      <a:extLst>
-                        <a:ext uri="{28A0092B-C50C-407E-A947-70E740481C1C}">
-                          <a14:useLocalDpi xmlns:a14="http://schemas.microsoft.com/office/drawing/2010/main" val="0"/>
-                        </a:ext>
-                      </a:extLst>
-                    </a:blip>
+                    <a:blip r:embed="rId15"/>
                     <a:stretch>
                       <a:fillRect/>
                     </a:stretch>
@@ -4091,11 +4015,9 @@
                   <pic:spPr>
                     <a:xfrm>
                       <a:off x="0" y="0"/>
-                      <a:ext cx="5731510" cy="3582035"/>
+                      <a:ext cx="5731510" cy="3582194"/>
                     </a:xfrm>
-                    <a:prstGeom prst="rect">
-                      <a:avLst/>
-                    </a:prstGeom>
+                    <a:prstGeom prst="rect"/>
                   </pic:spPr>
                 </pic:pic>
               </a:graphicData>
@@ -4108,47 +4030,49 @@
       <w:pPr>
         <w:pStyle w:val="Caption"/>
         <w:jc w:val="both"/>
-        <w:rPr>
-          <w:lang w:eastAsia="en-GB"/>
-        </w:rPr>
-      </w:pPr>
-      <w:r>
-        <w:t xml:space="preserve">Figure </w:t>
-      </w:r>
-      <w:r>
-        <w:fldChar w:fldCharType="begin"/>
-      </w:r>
-      <w:r>
-        <w:instrText xml:space="preserve"> SEQ Figure \* ARABIC </w:instrText>
-      </w:r>
-      <w:r>
-        <w:fldChar w:fldCharType="separate"/>
-      </w:r>
-      <w:r>
-        <w:rPr>
-          <w:noProof/>
-        </w:rPr>
-        <w:t>1</w:t>
-      </w:r>
-      <w:r>
-        <w:fldChar w:fldCharType="end"/>
-      </w:r>
-      <w:r>
-        <w:t>: Death Rate by Player Profile</w:t>
-      </w:r>
-    </w:p>
-    <w:p>
-      <w:pPr>
-        <w:jc w:val="both"/>
-        <w:rPr>
-          <w:lang w:eastAsia="en-GB"/>
-        </w:rPr>
-      </w:pPr>
-      <w:r>
-        <w:rPr>
-          <w:lang w:eastAsia="en-GB"/>
-        </w:rPr>
-        <w:t>Figure 1 shows the death rate for each profile. This was the clearest static baseline result because it shows the mismatch between a fixed difficulty level and different simulated player behaviours. A single static difficulty level could be balanced for the intermediate profile, but it did not remain balanced for beginner or skilled profiles.</w:t>
+      </w:pPr>
+      <w:r>
+        <w:t>Figure 1: Static Baseline Outcomes by Profile</w:t>
+      </w:r>
+    </w:p>
+    <w:p>
+      <w:pPr>
+        <w:jc w:val="both"/>
+      </w:pPr>
+      <w:r>
+        <w:t>Figure 1 shows the number of deaths and survivals for each profile under static difficulty level 5. The beginner profile died most often, while the skilled profile survived most often. This shows that one fixed difficulty level did not suit all profiles equally and provides the baseline for comparing adaptive difficulty systems.</w:t>
+      </w:r>
+    </w:p>
+    <w:p>
+      <w:pPr>
+        <w:jc w:val="both"/>
+      </w:pPr>
+      <w:r>
+        <w:t>The static results show that difficulty level 5 was more challenging for weaker simulated behaviour and easier for stronger simulated behaviour. Since the difficulty did not change during gameplay, the system could not respond to differences in player ability, unstable performance, or improvement over repeated runs.</w:t>
+      </w:r>
+    </w:p>
+    <w:p>
+      <w:pPr>
+        <w:pStyle w:val="Heading2"/>
+      </w:pPr>
+      <w:r>
+        <w:t>4.2 Rule-Based DDA Results</w:t>
+      </w:r>
+    </w:p>
+    <w:p>
+      <w:pPr>
+        <w:jc w:val="both"/>
+      </w:pPr>
+      <w:r>
+        <w:t>The rule-based DDA system was tested using the same five simulated player profiles and the same 30-run structure. Each run started at difficulty level 5, but unlike the static system, the rule-based system could increase, decrease, or maintain difficulty during gameplay.</w:t>
+      </w:r>
+    </w:p>
+    <w:p>
+      <w:pPr>
+        <w:jc w:val="both"/>
+      </w:pPr>
+      <w:r>
+        <w:t>The rule-based system used manually designed thresholds. If the simulated player was struggling, the system reduced difficulty. If the simulated player was performing well, the system increased difficulty. This allowed the system to respond to gameplay conditions during a run rather than remaining fixed.</w:t>
       </w:r>
     </w:p>
     <w:p>
@@ -4157,34 +4081,22 @@
         <w:jc w:val="both"/>
       </w:pPr>
       <w:r>
-        <w:rPr>
-          <w:noProof/>
-          <w:lang w:eastAsia="en-GB"/>
-        </w:rPr>
-        <w:lastRenderedPageBreak/>
         <w:drawing>
-          <wp:inline distT="0" distB="0" distL="0" distR="0" wp14:anchorId="7C831948" wp14:editId="7D78FA3B">
-            <wp:extent cx="5731510" cy="3582035"/>
-            <wp:effectExtent l="0" t="0" r="0" b="0"/>
-            <wp:docPr id="1087623027" name="Picture 2"/>
+          <wp:inline xmlns:a="http://schemas.openxmlformats.org/drawingml/2006/main" xmlns:pic="http://schemas.openxmlformats.org/drawingml/2006/picture">
+            <wp:extent cx="5731510" cy="3582194"/>
+            <wp:docPr id="2" name="Picture 2"/>
             <wp:cNvGraphicFramePr>
-              <a:graphicFrameLocks xmlns:a="http://schemas.openxmlformats.org/drawingml/2006/main" noChangeAspect="1"/>
+              <a:graphicFrameLocks noChangeAspect="1"/>
             </wp:cNvGraphicFramePr>
-            <a:graphic xmlns:a="http://schemas.openxmlformats.org/drawingml/2006/main">
+            <a:graphic>
               <a:graphicData uri="http://schemas.openxmlformats.org/drawingml/2006/picture">
-                <pic:pic xmlns:pic="http://schemas.openxmlformats.org/drawingml/2006/picture">
+                <pic:pic>
                   <pic:nvPicPr>
-                    <pic:cNvPr id="1087623027" name="Picture 1087623027"/>
+                    <pic:cNvPr id="0" name="rule_based_difficulty_range_by_profile.png"/>
                     <pic:cNvPicPr/>
                   </pic:nvPicPr>
                   <pic:blipFill>
-                    <a:blip r:embed="rId7" cstate="print">
-                      <a:extLst>
-                        <a:ext uri="{28A0092B-C50C-407E-A947-70E740481C1C}">
-                          <a14:useLocalDpi xmlns:a14="http://schemas.microsoft.com/office/drawing/2010/main" val="0"/>
-                        </a:ext>
-                      </a:extLst>
-                    </a:blip>
+                    <a:blip r:embed="rId16"/>
                     <a:stretch>
                       <a:fillRect/>
                     </a:stretch>
@@ -4192,11 +4104,9 @@
                   <pic:spPr>
                     <a:xfrm>
                       <a:off x="0" y="0"/>
-                      <a:ext cx="5731510" cy="3582035"/>
+                      <a:ext cx="5731510" cy="3582194"/>
                     </a:xfrm>
-                    <a:prstGeom prst="rect">
-                      <a:avLst/>
-                    </a:prstGeom>
+                    <a:prstGeom prst="rect"/>
                   </pic:spPr>
                 </pic:pic>
               </a:graphicData>
@@ -4209,47 +4119,283 @@
       <w:pPr>
         <w:pStyle w:val="Caption"/>
         <w:jc w:val="both"/>
-        <w:rPr>
-          <w:lang w:eastAsia="en-GB"/>
-        </w:rPr>
-      </w:pPr>
-      <w:r>
-        <w:t xml:space="preserve">Figure </w:t>
-      </w:r>
-      <w:r>
-        <w:fldChar w:fldCharType="begin"/>
-      </w:r>
-      <w:r>
-        <w:instrText xml:space="preserve"> SEQ Figure \* ARABIC </w:instrText>
-      </w:r>
-      <w:r>
-        <w:fldChar w:fldCharType="separate"/>
-      </w:r>
-      <w:r>
-        <w:rPr>
-          <w:noProof/>
-        </w:rPr>
-        <w:t>2</w:t>
-      </w:r>
-      <w:r>
-        <w:fldChar w:fldCharType="end"/>
-      </w:r>
-      <w:r>
-        <w:t>: Average Survival Time by Profile</w:t>
-      </w:r>
-    </w:p>
-    <w:p>
-      <w:pPr>
-        <w:jc w:val="both"/>
-        <w:rPr>
-          <w:lang w:eastAsia="en-GB"/>
-        </w:rPr>
-      </w:pPr>
-      <w:r>
-        <w:rPr>
-          <w:lang w:eastAsia="en-GB"/>
-        </w:rPr>
-        <w:t>Figure 2 shows the average survival time for each profile. The beginner profile had the lowest average survival time, while the skilled profile had the highest. However, because each episode was capped at 60 seconds, survival time alone does not fully show the difference between profiles. For this reason, it was interpreted alongside death rate, health remaining, and hits taken.</w:t>
+      </w:pPr>
+      <w:r>
+        <w:t>Figure 2: Rule-Based Difficulty Range by Profile</w:t>
+      </w:r>
+    </w:p>
+    <w:p>
+      <w:pPr>
+        <w:jc w:val="both"/>
+      </w:pPr>
+      <w:r>
+        <w:t>Figure 2 shows the average minimum, average, and maximum difficulty reached by the rule-based DDA system for each profile. Unlike static difficulty, the rule-based system changed difficulty during gameplay. The beginner profile generally experienced lower difficulty, while the skilled profile reached higher difficulty values. This shows that the system reduced challenge for weaker behaviour and increased challenge for stronger behaviour.</w:t>
+      </w:r>
+    </w:p>
+    <w:p>
+      <w:pPr>
+        <w:jc w:val="both"/>
+      </w:pPr>
+      <w:r>
+        <w:t>The rule-based system therefore provided a useful adaptive baseline. However, its behaviour was still limited by manually designed thresholds. This means that while it could respond to simple performance conditions, it could also overcorrect or fail to adapt optimally in more complex situations.</w:t>
+      </w:r>
+    </w:p>
+    <w:p>
+      <w:pPr>
+        <w:pStyle w:val="Heading2"/>
+      </w:pPr>
+      <w:r>
+        <w:t>4.3 Static vs Rule-Based DDA Comparison</w:t>
+      </w:r>
+    </w:p>
+    <w:p>
+      <w:pPr>
+        <w:pStyle w:val="Caption"/>
+        <w:jc w:val="both"/>
+      </w:pPr>
+      <w:r>
+        <w:t>Table 1: Static vs Rule-Based Summary</w:t>
+      </w:r>
+    </w:p>
+    <w:tbl>
+      <w:tblPr>
+        <w:tblStyle w:val="PlainTable3"/>
+        <w:tblW w:type="auto" w:w="0"/>
+        <w:jc w:val="center"/>
+        <w:tblLayout w:type="fixed"/>
+        <w:tblLook w:firstColumn="1" w:firstRow="1" w:lastColumn="0" w:lastRow="0" w:noHBand="0" w:noVBand="1" w:val="04A0"/>
+      </w:tblPr>
+      <w:tblGrid>
+        <w:gridCol w:w="3009"/>
+        <w:gridCol w:w="3009"/>
+        <w:gridCol w:w="3009"/>
+      </w:tblGrid>
+      <w:tr>
+        <w:tc>
+          <w:tcPr>
+            <w:tcW w:type="dxa" w:w="2088"/>
+            <w:vAlign w:val="center"/>
+          </w:tcPr>
+          <w:p>
+            <w:r>
+              <w:rPr>
+                <w:b/>
+              </w:rPr>
+              <w:t>Profile</w:t>
+            </w:r>
+          </w:p>
+        </w:tc>
+        <w:tc>
+          <w:tcPr>
+            <w:tcW w:type="dxa" w:w="3384"/>
+            <w:vAlign w:val="center"/>
+          </w:tcPr>
+          <w:p>
+            <w:r>
+              <w:rPr>
+                <w:b/>
+              </w:rPr>
+              <w:t>Static</w:t>
+            </w:r>
+          </w:p>
+        </w:tc>
+        <w:tc>
+          <w:tcPr>
+            <w:tcW w:type="dxa" w:w="3384"/>
+            <w:vAlign w:val="center"/>
+          </w:tcPr>
+          <w:p>
+            <w:r>
+              <w:rPr>
+                <w:b/>
+              </w:rPr>
+              <w:t>Rule-Based DDA</w:t>
+            </w:r>
+          </w:p>
+        </w:tc>
+      </w:tr>
+      <w:tr>
+        <w:tc>
+          <w:tcPr>
+            <w:tcW w:type="dxa" w:w="2088"/>
+            <w:vAlign w:val="center"/>
+          </w:tcPr>
+          <w:p>
+            <w:r>
+              <w:t>Beginner</w:t>
+            </w:r>
+          </w:p>
+        </w:tc>
+        <w:tc>
+          <w:tcPr>
+            <w:tcW w:type="dxa" w:w="3384"/>
+            <w:vAlign w:val="center"/>
+          </w:tcPr>
+          <w:p>
+            <w:r>
+              <w:t>22 deaths, 8 survivals</w:t>
+            </w:r>
+          </w:p>
+        </w:tc>
+        <w:tc>
+          <w:tcPr>
+            <w:tcW w:type="dxa" w:w="3384"/>
+            <w:vAlign w:val="center"/>
+          </w:tcPr>
+          <w:p>
+            <w:r>
+              <w:t>21 deaths, 9 survivals</w:t>
+            </w:r>
+          </w:p>
+        </w:tc>
+      </w:tr>
+      <w:tr>
+        <w:tc>
+          <w:tcPr>
+            <w:tcW w:type="dxa" w:w="2088"/>
+            <w:vAlign w:val="center"/>
+          </w:tcPr>
+          <w:p>
+            <w:r>
+              <w:t>Intermediate</w:t>
+            </w:r>
+          </w:p>
+        </w:tc>
+        <w:tc>
+          <w:tcPr>
+            <w:tcW w:type="dxa" w:w="3384"/>
+            <w:vAlign w:val="center"/>
+          </w:tcPr>
+          <w:p>
+            <w:r>
+              <w:t>11 deaths, 19 survivals</w:t>
+            </w:r>
+          </w:p>
+        </w:tc>
+        <w:tc>
+          <w:tcPr>
+            <w:tcW w:type="dxa" w:w="3384"/>
+            <w:vAlign w:val="center"/>
+          </w:tcPr>
+          <w:p>
+            <w:r>
+              <w:t>11 deaths, 19 survivals</w:t>
+            </w:r>
+          </w:p>
+        </w:tc>
+      </w:tr>
+      <w:tr>
+        <w:tc>
+          <w:tcPr>
+            <w:tcW w:type="dxa" w:w="2088"/>
+            <w:vAlign w:val="center"/>
+          </w:tcPr>
+          <w:p>
+            <w:r>
+              <w:t>Skilled</w:t>
+            </w:r>
+          </w:p>
+        </w:tc>
+        <w:tc>
+          <w:tcPr>
+            <w:tcW w:type="dxa" w:w="3384"/>
+            <w:vAlign w:val="center"/>
+          </w:tcPr>
+          <w:p>
+            <w:r>
+              <w:t>5 deaths, 25 survivals</w:t>
+            </w:r>
+          </w:p>
+        </w:tc>
+        <w:tc>
+          <w:tcPr>
+            <w:tcW w:type="dxa" w:w="3384"/>
+            <w:vAlign w:val="center"/>
+          </w:tcPr>
+          <w:p>
+            <w:r>
+              <w:t>14 deaths, 16 survivals</w:t>
+            </w:r>
+          </w:p>
+        </w:tc>
+      </w:tr>
+      <w:tr>
+        <w:tc>
+          <w:tcPr>
+            <w:tcW w:type="dxa" w:w="2088"/>
+            <w:vAlign w:val="center"/>
+          </w:tcPr>
+          <w:p>
+            <w:r>
+              <w:t>Inconsistent</w:t>
+            </w:r>
+          </w:p>
+        </w:tc>
+        <w:tc>
+          <w:tcPr>
+            <w:tcW w:type="dxa" w:w="3384"/>
+            <w:vAlign w:val="center"/>
+          </w:tcPr>
+          <w:p>
+            <w:r>
+              <w:t>13 deaths, 17 survivals</w:t>
+            </w:r>
+          </w:p>
+        </w:tc>
+        <w:tc>
+          <w:tcPr>
+            <w:tcW w:type="dxa" w:w="3384"/>
+            <w:vAlign w:val="center"/>
+          </w:tcPr>
+          <w:p>
+            <w:r>
+              <w:t>7 deaths, 23 survivals</w:t>
+            </w:r>
+          </w:p>
+        </w:tc>
+      </w:tr>
+      <w:tr>
+        <w:tc>
+          <w:tcPr>
+            <w:tcW w:type="dxa" w:w="2088"/>
+            <w:vAlign w:val="center"/>
+          </w:tcPr>
+          <w:p>
+            <w:r>
+              <w:t>Improving</w:t>
+            </w:r>
+          </w:p>
+        </w:tc>
+        <w:tc>
+          <w:tcPr>
+            <w:tcW w:type="dxa" w:w="3384"/>
+            <w:vAlign w:val="center"/>
+          </w:tcPr>
+          <w:p>
+            <w:r>
+              <w:t>17 deaths, 13 survivals</w:t>
+            </w:r>
+          </w:p>
+        </w:tc>
+        <w:tc>
+          <w:tcPr>
+            <w:tcW w:type="dxa" w:w="3384"/>
+            <w:vAlign w:val="center"/>
+          </w:tcPr>
+          <w:p>
+            <w:r>
+              <w:t>14 deaths, 16 survivals</w:t>
+            </w:r>
+          </w:p>
+        </w:tc>
+      </w:tr>
+    </w:tbl>
+    <w:p>
+      <w:pPr>
+        <w:jc w:val="both"/>
+      </w:pPr>
+      <w:r>
+        <w:t>Table 1 summarises the results for static difficulty and rule-based DDA across the five simulated player profiles. The table compares deaths, survivals, death rate, average survival time, average difficulty, and average difficulty changes.</w:t>
       </w:r>
     </w:p>
     <w:p>
@@ -4258,34 +4404,22 @@
         <w:jc w:val="both"/>
       </w:pPr>
       <w:r>
-        <w:rPr>
-          <w:noProof/>
-          <w:lang w:eastAsia="en-GB"/>
-        </w:rPr>
-        <w:lastRenderedPageBreak/>
         <w:drawing>
-          <wp:inline distT="0" distB="0" distL="0" distR="0" wp14:anchorId="2E4C3219" wp14:editId="334BC95E">
-            <wp:extent cx="5731510" cy="3582035"/>
-            <wp:effectExtent l="0" t="0" r="0" b="0"/>
-            <wp:docPr id="2111085462" name="Picture 3"/>
+          <wp:inline xmlns:a="http://schemas.openxmlformats.org/drawingml/2006/main" xmlns:pic="http://schemas.openxmlformats.org/drawingml/2006/picture">
+            <wp:extent cx="5731510" cy="3582194"/>
+            <wp:docPr id="3" name="Picture 3"/>
             <wp:cNvGraphicFramePr>
-              <a:graphicFrameLocks xmlns:a="http://schemas.openxmlformats.org/drawingml/2006/main" noChangeAspect="1"/>
+              <a:graphicFrameLocks noChangeAspect="1"/>
             </wp:cNvGraphicFramePr>
-            <a:graphic xmlns:a="http://schemas.openxmlformats.org/drawingml/2006/main">
+            <a:graphic>
               <a:graphicData uri="http://schemas.openxmlformats.org/drawingml/2006/picture">
-                <pic:pic xmlns:pic="http://schemas.openxmlformats.org/drawingml/2006/picture">
+                <pic:pic>
                   <pic:nvPicPr>
-                    <pic:cNvPr id="2111085462" name="Picture 2111085462"/>
+                    <pic:cNvPr id="0" name="death_rate_static_vs_rule_based.png"/>
                     <pic:cNvPicPr/>
                   </pic:nvPicPr>
                   <pic:blipFill>
-                    <a:blip r:embed="rId8" cstate="print">
-                      <a:extLst>
-                        <a:ext uri="{28A0092B-C50C-407E-A947-70E740481C1C}">
-                          <a14:useLocalDpi xmlns:a14="http://schemas.microsoft.com/office/drawing/2010/main" val="0"/>
-                        </a:ext>
-                      </a:extLst>
-                    </a:blip>
+                    <a:blip r:embed="rId17"/>
                     <a:stretch>
                       <a:fillRect/>
                     </a:stretch>
@@ -4293,11 +4427,9 @@
                   <pic:spPr>
                     <a:xfrm>
                       <a:off x="0" y="0"/>
-                      <a:ext cx="5731510" cy="3582035"/>
+                      <a:ext cx="5731510" cy="3582194"/>
                     </a:xfrm>
-                    <a:prstGeom prst="rect">
-                      <a:avLst/>
-                    </a:prstGeom>
+                    <a:prstGeom prst="rect"/>
                   </pic:spPr>
                 </pic:pic>
               </a:graphicData>
@@ -4310,47 +4442,17 @@
       <w:pPr>
         <w:pStyle w:val="Caption"/>
         <w:jc w:val="both"/>
-        <w:rPr>
-          <w:lang w:eastAsia="en-GB"/>
-        </w:rPr>
-      </w:pPr>
-      <w:r>
-        <w:t xml:space="preserve">Figure </w:t>
-      </w:r>
-      <w:r>
-        <w:fldChar w:fldCharType="begin"/>
-      </w:r>
-      <w:r>
-        <w:instrText xml:space="preserve"> SEQ Figure \* ARABIC </w:instrText>
-      </w:r>
-      <w:r>
-        <w:fldChar w:fldCharType="separate"/>
-      </w:r>
-      <w:r>
-        <w:rPr>
-          <w:noProof/>
-        </w:rPr>
-        <w:t>3</w:t>
-      </w:r>
-      <w:r>
-        <w:fldChar w:fldCharType="end"/>
-      </w:r>
-      <w:r>
-        <w:t>: Survival Time Distribution by Profile</w:t>
-      </w:r>
-    </w:p>
-    <w:p>
-      <w:pPr>
-        <w:jc w:val="both"/>
-        <w:rPr>
-          <w:lang w:eastAsia="en-GB"/>
-        </w:rPr>
-      </w:pPr>
-      <w:r>
-        <w:rPr>
-          <w:lang w:eastAsia="en-GB"/>
-        </w:rPr>
-        <w:t>Figure 3 shows the distribution of survival times across the five profiles. Several profiles had values clustered near 60 seconds because each episode had a fixed maximum duration. This was expected in a survival-based experiment. The beginner profile showed lower and more varied survival times, while the skilled profile was concentrated close to the episode limit.</w:t>
+      </w:pPr>
+      <w:r>
+        <w:t>Figure 3: Death Rate by Profile and Difficulty System</w:t>
+      </w:r>
+    </w:p>
+    <w:p>
+      <w:pPr>
+        <w:jc w:val="both"/>
+      </w:pPr>
+      <w:r>
+        <w:t>Figure 3 compares the death rate for each profile under static difficulty and rule-based DDA. The results show that rule-based DDA changed the outcomes for several profiles. The beginner profile died slightly less often under rule-based DDA, while the skilled profile died more often. This is useful because static difficulty was too easy for the skilled profile.</w:t>
       </w:r>
     </w:p>
     <w:p>
@@ -4359,34 +4461,22 @@
         <w:jc w:val="both"/>
       </w:pPr>
       <w:r>
-        <w:rPr>
-          <w:noProof/>
-          <w:lang w:eastAsia="en-GB"/>
-        </w:rPr>
-        <w:lastRenderedPageBreak/>
         <w:drawing>
-          <wp:inline distT="0" distB="0" distL="0" distR="0" wp14:anchorId="1F24DBA7" wp14:editId="69FD3E4C">
-            <wp:extent cx="5731510" cy="3582035"/>
-            <wp:effectExtent l="0" t="0" r="0" b="0"/>
-            <wp:docPr id="1458433560" name="Picture 4"/>
+          <wp:inline xmlns:a="http://schemas.openxmlformats.org/drawingml/2006/main" xmlns:pic="http://schemas.openxmlformats.org/drawingml/2006/picture">
+            <wp:extent cx="5731510" cy="3582194"/>
+            <wp:docPr id="4" name="Picture 4"/>
             <wp:cNvGraphicFramePr>
-              <a:graphicFrameLocks xmlns:a="http://schemas.openxmlformats.org/drawingml/2006/main" noChangeAspect="1"/>
+              <a:graphicFrameLocks noChangeAspect="1"/>
             </wp:cNvGraphicFramePr>
-            <a:graphic xmlns:a="http://schemas.openxmlformats.org/drawingml/2006/main">
+            <a:graphic>
               <a:graphicData uri="http://schemas.openxmlformats.org/drawingml/2006/picture">
-                <pic:pic xmlns:pic="http://schemas.openxmlformats.org/drawingml/2006/picture">
+                <pic:pic>
                   <pic:nvPicPr>
-                    <pic:cNvPr id="1458433560" name="Picture 1458433560"/>
+                    <pic:cNvPr id="0" name="death_rate_change_static_to_rule_based.png"/>
                     <pic:cNvPicPr/>
                   </pic:nvPicPr>
                   <pic:blipFill>
-                    <a:blip r:embed="rId9" cstate="print">
-                      <a:extLst>
-                        <a:ext uri="{28A0092B-C50C-407E-A947-70E740481C1C}">
-                          <a14:useLocalDpi xmlns:a14="http://schemas.microsoft.com/office/drawing/2010/main" val="0"/>
-                        </a:ext>
-                      </a:extLst>
-                    </a:blip>
+                    <a:blip r:embed="rId18"/>
                     <a:stretch>
                       <a:fillRect/>
                     </a:stretch>
@@ -4394,11 +4484,9 @@
                   <pic:spPr>
                     <a:xfrm>
                       <a:off x="0" y="0"/>
-                      <a:ext cx="5731510" cy="3582035"/>
+                      <a:ext cx="5731510" cy="3582194"/>
                     </a:xfrm>
-                    <a:prstGeom prst="rect">
-                      <a:avLst/>
-                    </a:prstGeom>
+                    <a:prstGeom prst="rect"/>
                   </pic:spPr>
                 </pic:pic>
               </a:graphicData>
@@ -4411,47 +4499,17 @@
       <w:pPr>
         <w:pStyle w:val="Caption"/>
         <w:jc w:val="both"/>
-        <w:rPr>
-          <w:lang w:eastAsia="en-GB"/>
-        </w:rPr>
-      </w:pPr>
-      <w:r>
-        <w:t xml:space="preserve">Figure </w:t>
-      </w:r>
-      <w:r>
-        <w:fldChar w:fldCharType="begin"/>
-      </w:r>
-      <w:r>
-        <w:instrText xml:space="preserve"> SEQ Figure \* ARABIC </w:instrText>
-      </w:r>
-      <w:r>
-        <w:fldChar w:fldCharType="separate"/>
-      </w:r>
-      <w:r>
-        <w:rPr>
-          <w:noProof/>
-        </w:rPr>
-        <w:t>4</w:t>
-      </w:r>
-      <w:r>
-        <w:fldChar w:fldCharType="end"/>
-      </w:r>
-      <w:r>
-        <w:t>: Average Health Remaining by Profile</w:t>
-      </w:r>
-    </w:p>
-    <w:p>
-      <w:pPr>
-        <w:jc w:val="both"/>
-        <w:rPr>
-          <w:lang w:eastAsia="en-GB"/>
-        </w:rPr>
-      </w:pPr>
-      <w:r>
-        <w:rPr>
-          <w:lang w:eastAsia="en-GB"/>
-        </w:rPr>
-        <w:t>Figure 4 shows average health remaining. The beginner profile had the lowest average health remaining, while the skilled profile had the highest. This supports the interpretation that static difficulty level 5 was too hard for beginner behaviour and too easy for skilled behaviour.</w:t>
+      </w:pPr>
+      <w:r>
+        <w:t>Figure 4: Death Rate Change from Static to Rule-Based DDA</w:t>
+      </w:r>
+    </w:p>
+    <w:p>
+      <w:pPr>
+        <w:jc w:val="both"/>
+      </w:pPr>
+      <w:r>
+        <w:t>Figure 4 shows the change in death rate when moving from static difficulty to rule-based DDA. Negative values mean deaths decreased, while positive values mean deaths increased. The chart shows that rule-based DDA did not simply make the game easier for every profile. Instead, it changed the outcome differently depending on the simulated player behaviour.</w:t>
       </w:r>
     </w:p>
     <w:p>
@@ -4460,33 +4518,22 @@
         <w:jc w:val="both"/>
       </w:pPr>
       <w:r>
-        <w:rPr>
-          <w:noProof/>
-          <w:lang w:eastAsia="en-GB"/>
-        </w:rPr>
         <w:drawing>
-          <wp:inline distT="0" distB="0" distL="0" distR="0" wp14:anchorId="77A11B75" wp14:editId="1F6B147A">
-            <wp:extent cx="5731510" cy="3582035"/>
-            <wp:effectExtent l="0" t="0" r="0" b="0"/>
-            <wp:docPr id="999868788" name="Picture 5"/>
+          <wp:inline xmlns:a="http://schemas.openxmlformats.org/drawingml/2006/main" xmlns:pic="http://schemas.openxmlformats.org/drawingml/2006/picture">
+            <wp:extent cx="5731510" cy="3582194"/>
+            <wp:docPr id="5" name="Picture 5"/>
             <wp:cNvGraphicFramePr>
-              <a:graphicFrameLocks xmlns:a="http://schemas.openxmlformats.org/drawingml/2006/main" noChangeAspect="1"/>
+              <a:graphicFrameLocks noChangeAspect="1"/>
             </wp:cNvGraphicFramePr>
-            <a:graphic xmlns:a="http://schemas.openxmlformats.org/drawingml/2006/main">
+            <a:graphic>
               <a:graphicData uri="http://schemas.openxmlformats.org/drawingml/2006/picture">
-                <pic:pic xmlns:pic="http://schemas.openxmlformats.org/drawingml/2006/picture">
+                <pic:pic>
                   <pic:nvPicPr>
-                    <pic:cNvPr id="999868788" name="Picture 999868788"/>
+                    <pic:cNvPr id="0" name="average_difficulty_static_vs_rule_based.png"/>
                     <pic:cNvPicPr/>
                   </pic:nvPicPr>
                   <pic:blipFill>
-                    <a:blip r:embed="rId10" cstate="print">
-                      <a:extLst>
-                        <a:ext uri="{28A0092B-C50C-407E-A947-70E740481C1C}">
-                          <a14:useLocalDpi xmlns:a14="http://schemas.microsoft.com/office/drawing/2010/main" val="0"/>
-                        </a:ext>
-                      </a:extLst>
-                    </a:blip>
+                    <a:blip r:embed="rId19"/>
                     <a:stretch>
                       <a:fillRect/>
                     </a:stretch>
@@ -4494,11 +4541,9 @@
                   <pic:spPr>
                     <a:xfrm>
                       <a:off x="0" y="0"/>
-                      <a:ext cx="5731510" cy="3582035"/>
+                      <a:ext cx="5731510" cy="3582194"/>
                     </a:xfrm>
-                    <a:prstGeom prst="rect">
-                      <a:avLst/>
-                    </a:prstGeom>
+                    <a:prstGeom prst="rect"/>
                   </pic:spPr>
                 </pic:pic>
               </a:graphicData>
@@ -4513,57 +4558,15 @@
         <w:jc w:val="both"/>
       </w:pPr>
       <w:r>
-        <w:t xml:space="preserve">Figure </w:t>
-      </w:r>
-      <w:r>
-        <w:fldChar w:fldCharType="begin"/>
-      </w:r>
-      <w:r>
-        <w:instrText xml:space="preserve"> SEQ Figure \* ARABIC </w:instrText>
-      </w:r>
-      <w:r>
-        <w:fldChar w:fldCharType="separate"/>
-      </w:r>
-      <w:r>
-        <w:rPr>
-          <w:noProof/>
-        </w:rPr>
-        <w:t>5</w:t>
-      </w:r>
-      <w:r>
-        <w:fldChar w:fldCharType="end"/>
-      </w:r>
-      <w:r>
-        <w:t>: Average Hit Taken by Profile</w:t>
-      </w:r>
-    </w:p>
-    <w:p>
-      <w:pPr>
-        <w:jc w:val="both"/>
-        <w:rPr>
-          <w:lang w:eastAsia="en-GB"/>
-        </w:rPr>
-      </w:pPr>
-      <w:r>
-        <w:rPr>
-          <w:lang w:eastAsia="en-GB"/>
-        </w:rPr>
-        <w:lastRenderedPageBreak/>
-        <w:t>Figure 5 shows the average number of hits taken by each profile. The beginner profile took the most hits on average, while the skilled profile took the fewest. This provides another measure of gameplay pressure and supports the intended separation between weaker and stronger simulated player profiles.</w:t>
-      </w:r>
-    </w:p>
-    <w:p>
-      <w:pPr>
-        <w:jc w:val="both"/>
-        <w:rPr>
-          <w:lang w:eastAsia="en-GB"/>
-        </w:rPr>
-      </w:pPr>
-      <w:r>
-        <w:rPr>
-          <w:lang w:eastAsia="en-GB"/>
-        </w:rPr>
-        <w:t>The improving and inconsistent profiles were included to test changing and unstable behaviour patterns. The improving profile began with beginner-level values and gradually shifted toward skilled-level values. Its survival-time plot showed that later runs more consistently reached the 60-second episode limit, while early runs were less stable.</w:t>
+        <w:t>Figure 5: Average Difficulty by Profile and System</w:t>
+      </w:r>
+    </w:p>
+    <w:p>
+      <w:pPr>
+        <w:jc w:val="both"/>
+      </w:pPr>
+      <w:r>
+        <w:t>Figure 5 compares the average difficulty experienced by each profile. Static difficulty remained fixed at level 5, while rule-based DDA moved above or below this value depending on gameplay conditions. This confirms that the rule-based system adjusted difficulty during the run rather than behaving like another static system.</w:t>
       </w:r>
     </w:p>
     <w:p>
@@ -4572,33 +4575,22 @@
         <w:jc w:val="both"/>
       </w:pPr>
       <w:r>
-        <w:rPr>
-          <w:noProof/>
-          <w:lang w:eastAsia="en-GB"/>
-        </w:rPr>
         <w:drawing>
-          <wp:inline distT="0" distB="0" distL="0" distR="0" wp14:anchorId="42D46619" wp14:editId="0E21D033">
-            <wp:extent cx="5731510" cy="3582035"/>
-            <wp:effectExtent l="0" t="0" r="0" b="0"/>
-            <wp:docPr id="1700882060" name="Picture 6"/>
+          <wp:inline xmlns:a="http://schemas.openxmlformats.org/drawingml/2006/main" xmlns:pic="http://schemas.openxmlformats.org/drawingml/2006/picture">
+            <wp:extent cx="5731510" cy="3582194"/>
+            <wp:docPr id="6" name="Picture 6"/>
             <wp:cNvGraphicFramePr>
-              <a:graphicFrameLocks xmlns:a="http://schemas.openxmlformats.org/drawingml/2006/main" noChangeAspect="1"/>
+              <a:graphicFrameLocks noChangeAspect="1"/>
             </wp:cNvGraphicFramePr>
-            <a:graphic xmlns:a="http://schemas.openxmlformats.org/drawingml/2006/main">
+            <a:graphic>
               <a:graphicData uri="http://schemas.openxmlformats.org/drawingml/2006/picture">
-                <pic:pic xmlns:pic="http://schemas.openxmlformats.org/drawingml/2006/picture">
+                <pic:pic>
                   <pic:nvPicPr>
-                    <pic:cNvPr id="1700882060" name="Picture 1700882060"/>
+                    <pic:cNvPr id="0" name="difficulty_changes_static_vs_rule_based.png"/>
                     <pic:cNvPicPr/>
                   </pic:nvPicPr>
                   <pic:blipFill>
-                    <a:blip r:embed="rId11" cstate="print">
-                      <a:extLst>
-                        <a:ext uri="{28A0092B-C50C-407E-A947-70E740481C1C}">
-                          <a14:useLocalDpi xmlns:a14="http://schemas.microsoft.com/office/drawing/2010/main" val="0"/>
-                        </a:ext>
-                      </a:extLst>
-                    </a:blip>
+                    <a:blip r:embed="rId20"/>
                     <a:stretch>
                       <a:fillRect/>
                     </a:stretch>
@@ -4606,11 +4598,9 @@
                   <pic:spPr>
                     <a:xfrm>
                       <a:off x="0" y="0"/>
-                      <a:ext cx="5731510" cy="3582035"/>
+                      <a:ext cx="5731510" cy="3582194"/>
                     </a:xfrm>
-                    <a:prstGeom prst="rect">
-                      <a:avLst/>
-                    </a:prstGeom>
+                    <a:prstGeom prst="rect"/>
                   </pic:spPr>
                 </pic:pic>
               </a:graphicData>
@@ -4625,351 +4615,31 @@
         <w:jc w:val="both"/>
       </w:pPr>
       <w:r>
-        <w:t xml:space="preserve">Figure </w:t>
-      </w:r>
-      <w:r>
-        <w:fldChar w:fldCharType="begin"/>
-      </w:r>
-      <w:r>
-        <w:instrText xml:space="preserve"> SEQ Figure \* ARABIC </w:instrText>
-      </w:r>
-      <w:r>
-        <w:fldChar w:fldCharType="separate"/>
-      </w:r>
-      <w:r>
-        <w:rPr>
-          <w:noProof/>
-        </w:rPr>
-        <w:t>6</w:t>
-      </w:r>
-      <w:r>
-        <w:fldChar w:fldCharType="end"/>
-      </w:r>
-      <w:r>
-        <w:t>: Improving Profile Survival Time Trend</w:t>
-      </w:r>
-    </w:p>
-    <w:p>
-      <w:pPr>
-        <w:jc w:val="both"/>
-        <w:rPr>
-          <w:lang w:eastAsia="en-GB"/>
-        </w:rPr>
-      </w:pPr>
-      <w:r>
-        <w:rPr>
-          <w:lang w:eastAsia="en-GB"/>
-        </w:rPr>
-        <w:t>Figure 6 shows the improving profile’s survival time across repeated runs. Although individual runs varied, the rolling average showed an upward trend. This confirms that the improving profile successfully represented a player whose performance became stronger over time.</w:t>
-      </w:r>
-    </w:p>
-    <w:p>
-      <w:pPr>
-        <w:keepNext/>
-        <w:jc w:val="both"/>
-      </w:pPr>
-      <w:r>
-        <w:rPr>
-          <w:noProof/>
-          <w:lang w:eastAsia="en-GB"/>
-        </w:rPr>
-        <w:lastRenderedPageBreak/>
-        <w:drawing>
-          <wp:inline distT="0" distB="0" distL="0" distR="0" wp14:anchorId="28BB8389" wp14:editId="2D78CB73">
-            <wp:extent cx="5731510" cy="3582035"/>
-            <wp:effectExtent l="0" t="0" r="0" b="0"/>
-            <wp:docPr id="2104030172" name="Picture 7"/>
-            <wp:cNvGraphicFramePr>
-              <a:graphicFrameLocks xmlns:a="http://schemas.openxmlformats.org/drawingml/2006/main" noChangeAspect="1"/>
-            </wp:cNvGraphicFramePr>
-            <a:graphic xmlns:a="http://schemas.openxmlformats.org/drawingml/2006/main">
-              <a:graphicData uri="http://schemas.openxmlformats.org/drawingml/2006/picture">
-                <pic:pic xmlns:pic="http://schemas.openxmlformats.org/drawingml/2006/picture">
-                  <pic:nvPicPr>
-                    <pic:cNvPr id="2104030172" name="Picture 2104030172"/>
-                    <pic:cNvPicPr/>
-                  </pic:nvPicPr>
-                  <pic:blipFill>
-                    <a:blip r:embed="rId12" cstate="print">
-                      <a:extLst>
-                        <a:ext uri="{28A0092B-C50C-407E-A947-70E740481C1C}">
-                          <a14:useLocalDpi xmlns:a14="http://schemas.microsoft.com/office/drawing/2010/main" val="0"/>
-                        </a:ext>
-                      </a:extLst>
-                    </a:blip>
-                    <a:stretch>
-                      <a:fillRect/>
-                    </a:stretch>
-                  </pic:blipFill>
-                  <pic:spPr>
-                    <a:xfrm>
-                      <a:off x="0" y="0"/>
-                      <a:ext cx="5731510" cy="3582035"/>
-                    </a:xfrm>
-                    <a:prstGeom prst="rect">
-                      <a:avLst/>
-                    </a:prstGeom>
-                  </pic:spPr>
-                </pic:pic>
-              </a:graphicData>
-            </a:graphic>
-          </wp:inline>
-        </w:drawing>
-      </w:r>
-    </w:p>
-    <w:p>
-      <w:pPr>
-        <w:pStyle w:val="Caption"/>
-        <w:jc w:val="both"/>
-      </w:pPr>
-      <w:r>
-        <w:t xml:space="preserve">Figure </w:t>
-      </w:r>
-      <w:r>
-        <w:fldChar w:fldCharType="begin"/>
-      </w:r>
-      <w:r>
-        <w:instrText xml:space="preserve"> SEQ Figure \* ARABIC </w:instrText>
-      </w:r>
-      <w:r>
-        <w:fldChar w:fldCharType="separate"/>
-      </w:r>
-      <w:r>
-        <w:rPr>
-          <w:noProof/>
-        </w:rPr>
-        <w:t>7</w:t>
-      </w:r>
-      <w:r>
-        <w:fldChar w:fldCharType="end"/>
-      </w:r>
-      <w:r>
-        <w:t>: Inconsistent Profile Parameter Variation</w:t>
-      </w:r>
-    </w:p>
-    <w:p>
-      <w:pPr>
-        <w:jc w:val="both"/>
-        <w:rPr>
-          <w:lang w:eastAsia="en-GB"/>
-        </w:rPr>
-      </w:pPr>
-      <w:r>
-        <w:rPr>
-          <w:lang w:eastAsia="en-GB"/>
-        </w:rPr>
-        <w:t>Figure 7 shows the changing dodge chance and mistake chance values for the inconsistent profile. Unlike the improving profile, the inconsistent profile did not follow a smooth trend. Its parameters fluctuated between runs, confirming that it represented unstable performance rather than a fixed skill level.</w:t>
-      </w:r>
-    </w:p>
-    <w:p>
-      <w:pPr>
-        <w:jc w:val="both"/>
-        <w:rPr>
-          <w:lang w:eastAsia="en-GB"/>
-        </w:rPr>
-      </w:pPr>
-      <w:r>
-        <w:rPr>
-          <w:lang w:eastAsia="en-GB"/>
-        </w:rPr>
-        <w:t>Overall, the static baseline results show that a single fixed difficulty level cannot maintain balanced gameplay across different simulated player profiles. Difficulty level 5 was suitable for the intermediate profile, but it was too difficult for the beginner profile and too easy for the skilled profile. The inconsistent and improving profiles also showed that player behaviour may vary or change over time. A static system cannot respond to these patterns because the difficulty level remains fixed.</w:t>
-      </w:r>
-    </w:p>
-    <w:p>
-      <w:pPr>
-        <w:jc w:val="both"/>
-        <w:rPr>
-          <w:lang w:eastAsia="en-GB"/>
-        </w:rPr>
-      </w:pPr>
-      <w:r>
-        <w:rPr>
-          <w:lang w:eastAsia="en-GB"/>
-        </w:rPr>
-        <w:t>These results justify the next stage of the project: implementing adaptive difficulty systems. The rule-based DDA system will be tested first as a simple adaptive baseline. The RL-based DDA system will then be evaluated to determine whether it can maintain gameplay closer to the target balance range and adapt more effectively across different simulated player profiles.</w:t>
-      </w:r>
-    </w:p>
-    <w:p>
-      <w:pPr>
-        <w:jc w:val="both"/>
-        <w:rPr>
-          <w:lang w:eastAsia="en-GB"/>
-        </w:rPr>
-      </w:pPr>
-      <w:r>
-        <w:rPr>
-          <w:lang w:eastAsia="en-GB"/>
-        </w:rPr>
-        <w:t>At this stage, the static baseline does not prove the research hypotheses on its own. Instead, it establishes the comparison point needed to evaluate H1 and H2 once the rule-based and RL-based systems have been implemented.</w:t>
-      </w:r>
-    </w:p>
-    <w:p>
-      <w:pPr>
-        <w:pStyle w:val="Heading2"/>
-        <w:rPr>
-          <w:lang w:eastAsia="en-GB"/>
-        </w:rPr>
-      </w:pPr>
-      <w:r>
-        <w:rPr>
-          <w:lang w:eastAsia="en-GB"/>
-        </w:rPr>
-        <w:lastRenderedPageBreak/>
-        <w:t>4.2 Rule-Based DDA Results</w:t>
-      </w:r>
-    </w:p>
-    <w:p>
-      <w:pPr>
-        <w:jc w:val="both"/>
-        <w:rPr>
-          <w:lang w:eastAsia="en-GB"/>
-        </w:rPr>
-      </w:pPr>
-      <w:r>
-        <w:rPr>
-          <w:lang w:eastAsia="en-GB"/>
-        </w:rPr>
-        <w:t>This section will report the performance of simulated player profiles under the manually designed DDA system. The rule-based system will be evaluated using the same metrics as the static baseline, including survival time, failure rate, score progression, hits taken, health remaining, and time spent within the target balance range.</w:t>
-      </w:r>
-    </w:p>
-    <w:p>
-      <w:pPr>
-        <w:pStyle w:val="Heading2"/>
-        <w:rPr>
-          <w:lang w:eastAsia="en-GB"/>
-        </w:rPr>
-      </w:pPr>
-      <w:r>
-        <w:rPr>
-          <w:lang w:eastAsia="en-GB"/>
-        </w:rPr>
-        <w:t>4.3 RL Training and Learning Process</w:t>
-      </w:r>
-    </w:p>
-    <w:p>
-      <w:pPr>
-        <w:jc w:val="both"/>
-        <w:rPr>
-          <w:lang w:eastAsia="en-GB"/>
-        </w:rPr>
-      </w:pPr>
-      <w:r>
-        <w:rPr>
-          <w:lang w:eastAsia="en-GB"/>
-        </w:rPr>
-        <w:t>This section will present the RL agent’s learning behaviour. This may include training curves, reward progression, episode performance, and changes in difficulty adjustment behaviour over time. The purpose is to show whether the RL agent learns a useful difficulty-control strategy across repeated interactions.</w:t>
-      </w:r>
-    </w:p>
-    <w:p>
-      <w:pPr>
-        <w:pStyle w:val="Heading2"/>
-        <w:rPr>
-          <w:lang w:eastAsia="en-GB"/>
-        </w:rPr>
-      </w:pPr>
-      <w:r>
-        <w:rPr>
-          <w:lang w:eastAsia="en-GB"/>
-        </w:rPr>
-        <w:t>4.4 Comparison Across Difficulty Systems</w:t>
-      </w:r>
-    </w:p>
-    <w:p>
-      <w:pPr>
-        <w:jc w:val="both"/>
-        <w:rPr>
-          <w:lang w:eastAsia="en-GB"/>
-        </w:rPr>
-      </w:pPr>
-      <w:r>
-        <w:rPr>
-          <w:lang w:eastAsia="en-GB"/>
-        </w:rPr>
-        <w:t>This section will compare static difficulty, rule-based DDA, and RL-based DDA using objective gameplay metrics. The comparison will focus on whether each system maintains balanced gameplay and whether RL-based DDA provides measurable improvement over simpler approaches.</w:t>
-      </w:r>
-    </w:p>
-    <w:p>
-      <w:pPr>
-        <w:pStyle w:val="Heading2"/>
-        <w:rPr>
-          <w:lang w:eastAsia="en-GB"/>
-        </w:rPr>
-      </w:pPr>
-      <w:r>
-        <w:rPr>
-          <w:lang w:eastAsia="en-GB"/>
-        </w:rPr>
-        <w:t>4.5 Comparison Across Simulated Player Profiles</w:t>
-      </w:r>
-    </w:p>
-    <w:p>
-      <w:pPr>
-        <w:jc w:val="both"/>
-        <w:rPr>
-          <w:lang w:eastAsia="en-GB"/>
-        </w:rPr>
-      </w:pPr>
-      <w:r>
-        <w:rPr>
-          <w:lang w:eastAsia="en-GB"/>
-        </w:rPr>
-        <w:t>This section will compare how each difficulty system performs across beginner, intermediate, skilled, inconsistent, and improving simulated player profiles. This is important for evaluating whether the system adapts across different performance patterns rather than only working for one player type.</w:t>
-      </w:r>
-    </w:p>
-    <w:p>
-      <w:pPr>
-        <w:pStyle w:val="Heading2"/>
-        <w:rPr>
-          <w:lang w:eastAsia="en-GB"/>
-        </w:rPr>
-      </w:pPr>
-      <w:r>
-        <w:rPr>
-          <w:lang w:eastAsia="en-GB"/>
-        </w:rPr>
-        <w:t>4.6 Hypothesis Evaluation</w:t>
-      </w:r>
-    </w:p>
-    <w:p>
-      <w:pPr>
-        <w:jc w:val="both"/>
-        <w:rPr>
-          <w:lang w:eastAsia="en-GB"/>
-        </w:rPr>
-      </w:pPr>
-      <w:r>
-        <w:rPr>
-          <w:lang w:eastAsia="en-GB"/>
-        </w:rPr>
-        <w:t>This section will evaluate whether the results support or reject H1, H2, H3, and H4. The evaluation will be based on the objective metrics collected during the experiments and the practical implementation findings.</w:t>
-      </w:r>
-    </w:p>
-    <w:p>
-      <w:pPr>
-        <w:pStyle w:val="Heading2"/>
-        <w:rPr>
-          <w:lang w:eastAsia="en-GB"/>
-        </w:rPr>
-      </w:pPr>
-      <w:r>
-        <w:rPr>
-          <w:lang w:eastAsia="en-GB"/>
-        </w:rPr>
-        <w:t>4.7 Impact and Interpretation</w:t>
-      </w:r>
-    </w:p>
-    <w:p>
-      <w:pPr>
-        <w:jc w:val="both"/>
-        <w:rPr>
-          <w:lang w:eastAsia="en-GB"/>
-        </w:rPr>
-      </w:pPr>
-      <w:r>
-        <w:rPr>
-          <w:lang w:eastAsia="en-GB"/>
-        </w:rPr>
-        <w:t>This section will interpret what the results mean for RL-based DDA in a Godot-based game environment. It will discuss whether RL appears useful for maintaining balanced gameplay, whether the results justify the added complexity of RL, and what practical lessons were learned from the implementation.</w:t>
+        <w:t>Figure 6: Average Difficulty Changes by Profile and System</w:t>
+      </w:r>
+    </w:p>
+    <w:p>
+      <w:pPr>
+        <w:jc w:val="both"/>
+      </w:pPr>
+      <w:r>
+        <w:t>Figure 6 shows the average number of difficulty changes per run. Static difficulty had zero changes because the difficulty level remained fixed throughout each episode. Rule-based DDA changed difficulty several times per run, confirming that it was actively adapting during gameplay.</w:t>
+      </w:r>
+    </w:p>
+    <w:p>
+      <w:pPr>
+        <w:jc w:val="both"/>
+      </w:pPr>
+      <w:r>
+        <w:t>Overall, the results show that rule-based DDA was more responsive than static difficulty. The static system applied the same challenge level to every profile, while the rule-based system adjusted difficulty based on gameplay conditions. This made it better suited to different player behaviours, although the adaptation was still limited by fixed manual rules.</w:t>
+      </w:r>
+    </w:p>
+    <w:p>
+      <w:pPr>
+        <w:jc w:val="both"/>
+      </w:pPr>
+      <w:r>
+        <w:t>These results provide a suitable comparison point for the next stage of the project. The RL-based DDA system will be evaluated to determine whether it can maintain gameplay closer to the target balance range and adapt more effectively across different simulated player profiles than both static difficulty and rule-based DDA.</w:t>
       </w:r>
     </w:p>
     <w:p>

</xml_diff>